<commit_message>
Correção de testes - principalmente test_services
</commit_message>
<xml_diff>
--- a/eventosmeta/documentacao/01-Fundações-Estática.docx
+++ b/eventosmeta/documentacao/01-Fundações-Estática.docx
@@ -2087,13 +2087,442 @@
       <w:pPr>
         <w:pStyle w:val="Heading3"/>
       </w:pPr>
+      <w:r>
+        <w:t xml:space="preserve">3. </w:t>
+      </w:r>
+      <w:r>
+        <w:t xml:space="preserve">Lógica da </w:t>
+      </w:r>
+      <w:r>
+        <w:t>Regra d</w:t>
+      </w:r>
+      <w:r>
+        <w:t>e N</w:t>
+      </w:r>
+      <w:r>
+        <w:t>egócio</w:t>
+      </w:r>
+    </w:p>
+    <w:p>
+      <w:pPr>
+        <w:pStyle w:val="NormalWeb"/>
+        <w:spacing w:line="276" w:lineRule="auto"/>
+        <w:ind w:left="708"/>
+      </w:pPr>
+      <w:r>
+        <w:rPr>
+          <w:rFonts w:ascii="Calibri" w:eastAsia="Calibri" w:hAnsi="Calibri" w:cs="Calibri"/>
+          <w:sz w:val="22"/>
+          <w:szCs w:val="22"/>
+        </w:rPr>
+        <w:t xml:space="preserve">• Retornar </w:t>
+      </w:r>
+      <w:proofErr w:type="gramStart"/>
+      <w:r>
+        <w:rPr>
+          <w:rFonts w:ascii="Calibri" w:eastAsia="Calibri" w:hAnsi="Calibri" w:cs="Calibri"/>
+          <w:sz w:val="22"/>
+          <w:szCs w:val="22"/>
+        </w:rPr>
+        <w:t>0</w:t>
+      </w:r>
+      <w:proofErr w:type="gramEnd"/>
+      <w:r>
+        <w:rPr>
+          <w:rFonts w:ascii="Calibri" w:eastAsia="Calibri" w:hAnsi="Calibri" w:cs="Calibri"/>
+          <w:sz w:val="22"/>
+          <w:szCs w:val="22"/>
+        </w:rPr>
+        <w:t xml:space="preserve"> pontos para inscrição sem critérios.</w:t>
+      </w:r>
+      <w:r>
+        <w:rPr>
+          <w:rFonts w:ascii="Calibri" w:eastAsia="Calibri" w:hAnsi="Calibri" w:cs="Calibri"/>
+          <w:sz w:val="22"/>
+          <w:szCs w:val="22"/>
+        </w:rPr>
+        <w:br/>
+        <w:t xml:space="preserve">• Apenas inscrições com status: Pendente, Classificado, Lista de Espera participam </w:t>
+      </w:r>
+      <w:r>
+        <w:rPr>
+          <w:rFonts w:ascii="Calibri" w:eastAsia="Calibri" w:hAnsi="Calibri" w:cs="Calibri"/>
+          <w:sz w:val="22"/>
+          <w:szCs w:val="22"/>
+        </w:rPr>
+        <w:br/>
+        <w:t xml:space="preserve">• Classificação </w:t>
+      </w:r>
+      <w:proofErr w:type="spellStart"/>
+      <w:r>
+        <w:rPr>
+          <w:rFonts w:ascii="Calibri" w:eastAsia="Calibri" w:hAnsi="Calibri" w:cs="Calibri"/>
+          <w:sz w:val="22"/>
+          <w:szCs w:val="22"/>
+        </w:rPr>
+        <w:t>order_fields</w:t>
+      </w:r>
+      <w:proofErr w:type="spellEnd"/>
+      <w:r>
+        <w:rPr>
+          <w:rFonts w:ascii="Calibri" w:eastAsia="Calibri" w:hAnsi="Calibri" w:cs="Calibri"/>
+          <w:sz w:val="22"/>
+          <w:szCs w:val="22"/>
+        </w:rPr>
+        <w:t xml:space="preserve"> = </w:t>
+      </w:r>
+      <w:proofErr w:type="spellStart"/>
+      <w:r>
+        <w:rPr>
+          <w:rFonts w:ascii="Calibri" w:eastAsia="Calibri" w:hAnsi="Calibri" w:cs="Calibri"/>
+          <w:sz w:val="22"/>
+          <w:szCs w:val="22"/>
+        </w:rPr>
+        <w:t>pontuacao_total</w:t>
+      </w:r>
+      <w:proofErr w:type="spellEnd"/>
+      <w:r>
+        <w:rPr>
+          <w:rFonts w:ascii="Calibri" w:eastAsia="Calibri" w:hAnsi="Calibri" w:cs="Calibri"/>
+          <w:sz w:val="22"/>
+          <w:szCs w:val="22"/>
+        </w:rPr>
+        <w:t xml:space="preserve">, </w:t>
+      </w:r>
+      <w:proofErr w:type="spellStart"/>
+      <w:r>
+        <w:rPr>
+          <w:rFonts w:ascii="Calibri" w:eastAsia="Calibri" w:hAnsi="Calibri" w:cs="Calibri"/>
+          <w:sz w:val="22"/>
+          <w:szCs w:val="22"/>
+        </w:rPr>
+        <w:t>inscricao__data_inscricao</w:t>
+      </w:r>
+      <w:proofErr w:type="spellEnd"/>
+      <w:r>
+        <w:rPr>
+          <w:rFonts w:ascii="Calibri" w:eastAsia="Calibri" w:hAnsi="Calibri" w:cs="Calibri"/>
+          <w:sz w:val="22"/>
+          <w:szCs w:val="22"/>
+        </w:rPr>
+        <w:t xml:space="preserve"> </w:t>
+      </w:r>
+      <w:proofErr w:type="spellStart"/>
+      <w:r>
+        <w:rPr>
+          <w:rFonts w:ascii="Calibri" w:eastAsia="Calibri" w:hAnsi="Calibri" w:cs="Calibri"/>
+          <w:sz w:val="22"/>
+          <w:szCs w:val="22"/>
+        </w:rPr>
+        <w:t>Desc</w:t>
+      </w:r>
+      <w:proofErr w:type="spellEnd"/>
+      <w:r>
+        <w:rPr>
+          <w:rFonts w:ascii="Calibri" w:eastAsia="Calibri" w:hAnsi="Calibri" w:cs="Calibri"/>
+          <w:sz w:val="22"/>
+          <w:szCs w:val="22"/>
+        </w:rPr>
+        <w:t xml:space="preserve"> (do maior para o menor)</w:t>
+      </w:r>
+      <w:r>
+        <w:rPr>
+          <w:rFonts w:ascii="Calibri" w:eastAsia="Calibri" w:hAnsi="Calibri" w:cs="Calibri"/>
+          <w:sz w:val="22"/>
+          <w:szCs w:val="22"/>
+        </w:rPr>
+        <w:br/>
+        <w:t xml:space="preserve">• Após classificação, status da inscrição é atualizado para: Classificado (se posição &lt;= </w:t>
+      </w:r>
+      <w:proofErr w:type="spellStart"/>
+      <w:r>
+        <w:rPr>
+          <w:rFonts w:ascii="Calibri" w:eastAsia="Calibri" w:hAnsi="Calibri" w:cs="Calibri"/>
+          <w:sz w:val="22"/>
+          <w:szCs w:val="22"/>
+        </w:rPr>
+        <w:t>total_vagas</w:t>
+      </w:r>
+      <w:proofErr w:type="spellEnd"/>
+      <w:r>
+        <w:rPr>
+          <w:rFonts w:ascii="Calibri" w:eastAsia="Calibri" w:hAnsi="Calibri" w:cs="Calibri"/>
+          <w:sz w:val="22"/>
+          <w:szCs w:val="22"/>
+        </w:rPr>
+        <w:t xml:space="preserve">) </w:t>
+      </w:r>
+      <w:r>
+        <w:rPr>
+          <w:rFonts w:ascii="Calibri" w:eastAsia="Calibri" w:hAnsi="Calibri" w:cs="Calibri"/>
+          <w:sz w:val="22"/>
+          <w:szCs w:val="22"/>
+        </w:rPr>
+        <w:br/>
+        <w:t xml:space="preserve">• Lista de Espera (se posição &gt; </w:t>
+      </w:r>
+      <w:proofErr w:type="spellStart"/>
+      <w:r>
+        <w:rPr>
+          <w:rFonts w:ascii="Calibri" w:eastAsia="Calibri" w:hAnsi="Calibri" w:cs="Calibri"/>
+          <w:sz w:val="22"/>
+          <w:szCs w:val="22"/>
+        </w:rPr>
+        <w:t>total_vagas</w:t>
+      </w:r>
+      <w:proofErr w:type="spellEnd"/>
+      <w:r>
+        <w:rPr>
+          <w:rFonts w:ascii="Calibri" w:eastAsia="Calibri" w:hAnsi="Calibri" w:cs="Calibri"/>
+          <w:sz w:val="22"/>
+          <w:szCs w:val="22"/>
+        </w:rPr>
+        <w:t xml:space="preserve">) </w:t>
+      </w:r>
+      <w:r>
+        <w:rPr>
+          <w:rFonts w:ascii="Calibri" w:eastAsia="Calibri" w:hAnsi="Calibri" w:cs="Calibri"/>
+          <w:sz w:val="22"/>
+          <w:szCs w:val="22"/>
+        </w:rPr>
+        <w:br/>
+        <w:t>• Status do evento é alterado para "Resultado Divulgado" (ID=5)</w:t>
+      </w:r>
     </w:p>
     <w:p>
       <w:pPr>
         <w:pStyle w:val="Heading3"/>
       </w:pPr>
-      <w:r>
-        <w:t>3. Glossário de Termos</w:t>
+    </w:p>
+    <w:p>
+      <w:pPr>
+        <w:spacing w:after="0" w:line="240" w:lineRule="auto"/>
+        <w:rPr>
+          <w:rFonts w:ascii="Times New Roman" w:eastAsia="Times New Roman" w:hAnsi="Times New Roman" w:cs="Times New Roman"/>
+          <w:sz w:val="24"/>
+          <w:szCs w:val="24"/>
+        </w:rPr>
+      </w:pPr>
+      <w:r>
+        <w:rPr>
+          <w:rFonts w:ascii="Times New Roman" w:eastAsia="Times New Roman" w:hAnsi="Symbol" w:cs="Times New Roman"/>
+          <w:sz w:val="24"/>
+          <w:szCs w:val="24"/>
+        </w:rPr>
+        <w:t></w:t>
+      </w:r>
+      <w:proofErr w:type="gramStart"/>
+      <w:r>
+        <w:rPr>
+          <w:rFonts w:ascii="Times New Roman" w:eastAsia="Times New Roman" w:hAnsi="Times New Roman" w:cs="Times New Roman"/>
+          <w:sz w:val="24"/>
+          <w:szCs w:val="24"/>
+        </w:rPr>
+        <w:t xml:space="preserve">  </w:t>
+      </w:r>
+      <w:proofErr w:type="gramEnd"/>
+      <w:r>
+        <w:rPr>
+          <w:rFonts w:ascii="Times New Roman" w:eastAsia="Times New Roman" w:hAnsi="Times New Roman" w:cs="Times New Roman"/>
+          <w:sz w:val="24"/>
+          <w:szCs w:val="24"/>
+        </w:rPr>
+        <w:t xml:space="preserve">Percorre todos os critérios do evento </w:t>
+      </w:r>
+    </w:p>
+    <w:p>
+      <w:pPr>
+        <w:spacing w:after="0" w:line="240" w:lineRule="auto"/>
+        <w:rPr>
+          <w:rFonts w:ascii="Times New Roman" w:eastAsia="Times New Roman" w:hAnsi="Times New Roman" w:cs="Times New Roman"/>
+          <w:sz w:val="24"/>
+          <w:szCs w:val="24"/>
+        </w:rPr>
+      </w:pPr>
+      <w:r>
+        <w:rPr>
+          <w:rFonts w:ascii="Times New Roman" w:eastAsia="Times New Roman" w:hAnsi="Symbol" w:cs="Times New Roman"/>
+          <w:sz w:val="24"/>
+          <w:szCs w:val="24"/>
+        </w:rPr>
+        <w:t></w:t>
+      </w:r>
+      <w:proofErr w:type="gramStart"/>
+      <w:r>
+        <w:rPr>
+          <w:rFonts w:ascii="Times New Roman" w:eastAsia="Times New Roman" w:hAnsi="Times New Roman" w:cs="Times New Roman"/>
+          <w:sz w:val="24"/>
+          <w:szCs w:val="24"/>
+        </w:rPr>
+        <w:t xml:space="preserve">  </w:t>
+      </w:r>
+      <w:proofErr w:type="gramEnd"/>
+      <w:r>
+        <w:rPr>
+          <w:rFonts w:ascii="Times New Roman" w:eastAsia="Times New Roman" w:hAnsi="Times New Roman" w:cs="Times New Roman"/>
+          <w:sz w:val="24"/>
+          <w:szCs w:val="24"/>
+        </w:rPr>
+        <w:t>Para CADA critério, valida se o interessado atende (</w:t>
+      </w:r>
+      <w:proofErr w:type="spellStart"/>
+      <w:r>
+        <w:rPr>
+          <w:rFonts w:ascii="Times New Roman" w:eastAsia="Times New Roman" w:hAnsi="Times New Roman" w:cs="Times New Roman"/>
+          <w:sz w:val="24"/>
+          <w:szCs w:val="24"/>
+        </w:rPr>
+        <w:t>pcd_fisica</w:t>
+      </w:r>
+      <w:proofErr w:type="spellEnd"/>
+      <w:r>
+        <w:rPr>
+          <w:rFonts w:ascii="Times New Roman" w:eastAsia="Times New Roman" w:hAnsi="Times New Roman" w:cs="Times New Roman"/>
+          <w:sz w:val="24"/>
+          <w:szCs w:val="24"/>
+        </w:rPr>
+        <w:t xml:space="preserve">, </w:t>
+      </w:r>
+      <w:proofErr w:type="spellStart"/>
+      <w:r>
+        <w:rPr>
+          <w:rFonts w:ascii="Times New Roman" w:eastAsia="Times New Roman" w:hAnsi="Times New Roman" w:cs="Times New Roman"/>
+          <w:sz w:val="24"/>
+          <w:szCs w:val="24"/>
+        </w:rPr>
+        <w:t>programa_social</w:t>
+      </w:r>
+      <w:proofErr w:type="spellEnd"/>
+      <w:r>
+        <w:rPr>
+          <w:rFonts w:ascii="Times New Roman" w:eastAsia="Times New Roman" w:hAnsi="Times New Roman" w:cs="Times New Roman"/>
+          <w:sz w:val="24"/>
+          <w:szCs w:val="24"/>
+        </w:rPr>
+        <w:t xml:space="preserve">, </w:t>
+      </w:r>
+      <w:proofErr w:type="spellStart"/>
+      <w:r>
+        <w:rPr>
+          <w:rFonts w:ascii="Times New Roman" w:eastAsia="Times New Roman" w:hAnsi="Times New Roman" w:cs="Times New Roman"/>
+          <w:sz w:val="24"/>
+          <w:szCs w:val="24"/>
+        </w:rPr>
+        <w:t>fototipo</w:t>
+      </w:r>
+      <w:proofErr w:type="spellEnd"/>
+      <w:r>
+        <w:rPr>
+          <w:rFonts w:ascii="Times New Roman" w:eastAsia="Times New Roman" w:hAnsi="Times New Roman" w:cs="Times New Roman"/>
+          <w:sz w:val="24"/>
+          <w:szCs w:val="24"/>
+        </w:rPr>
+        <w:t xml:space="preserve">, </w:t>
+      </w:r>
+      <w:proofErr w:type="spellStart"/>
+      <w:r>
+        <w:rPr>
+          <w:rFonts w:ascii="Times New Roman" w:eastAsia="Times New Roman" w:hAnsi="Times New Roman" w:cs="Times New Roman"/>
+          <w:sz w:val="24"/>
+          <w:szCs w:val="24"/>
+        </w:rPr>
+        <w:t>etc</w:t>
+      </w:r>
+      <w:proofErr w:type="spellEnd"/>
+      <w:r>
+        <w:rPr>
+          <w:rFonts w:ascii="Times New Roman" w:eastAsia="Times New Roman" w:hAnsi="Times New Roman" w:cs="Times New Roman"/>
+          <w:sz w:val="24"/>
+          <w:szCs w:val="24"/>
+        </w:rPr>
+        <w:t xml:space="preserve">) </w:t>
+      </w:r>
+    </w:p>
+    <w:p>
+      <w:pPr>
+        <w:spacing w:after="0" w:line="240" w:lineRule="auto"/>
+        <w:rPr>
+          <w:rFonts w:ascii="Times New Roman" w:eastAsia="Times New Roman" w:hAnsi="Times New Roman" w:cs="Times New Roman"/>
+          <w:sz w:val="24"/>
+          <w:szCs w:val="24"/>
+        </w:rPr>
+      </w:pPr>
+      <w:r>
+        <w:rPr>
+          <w:rFonts w:ascii="Times New Roman" w:eastAsia="Times New Roman" w:hAnsi="Symbol" w:cs="Times New Roman"/>
+          <w:sz w:val="24"/>
+          <w:szCs w:val="24"/>
+        </w:rPr>
+        <w:t></w:t>
+      </w:r>
+      <w:proofErr w:type="gramStart"/>
+      <w:r>
+        <w:rPr>
+          <w:rFonts w:ascii="Times New Roman" w:eastAsia="Times New Roman" w:hAnsi="Times New Roman" w:cs="Times New Roman"/>
+          <w:sz w:val="24"/>
+          <w:szCs w:val="24"/>
+        </w:rPr>
+        <w:t xml:space="preserve">  </w:t>
+      </w:r>
+      <w:proofErr w:type="gramEnd"/>
+      <w:r>
+        <w:rPr>
+          <w:rFonts w:ascii="Times New Roman" w:eastAsia="Times New Roman" w:hAnsi="Times New Roman" w:cs="Times New Roman"/>
+          <w:sz w:val="24"/>
+          <w:szCs w:val="24"/>
+        </w:rPr>
+        <w:t xml:space="preserve">Se atende, soma os pontos </w:t>
+      </w:r>
+    </w:p>
+    <w:p>
+      <w:pPr>
+        <w:rPr>
+          <w:b/>
+          <w:bCs/>
+          <w:sz w:val="28"/>
+          <w:szCs w:val="28"/>
+        </w:rPr>
+      </w:pPr>
+      <w:r>
+        <w:rPr>
+          <w:rFonts w:ascii="Times New Roman" w:eastAsia="Times New Roman" w:hAnsi="Symbol" w:cs="Times New Roman"/>
+          <w:sz w:val="24"/>
+          <w:szCs w:val="24"/>
+        </w:rPr>
+        <w:t></w:t>
+      </w:r>
+      <w:proofErr w:type="gramStart"/>
+      <w:r>
+        <w:rPr>
+          <w:rFonts w:ascii="Times New Roman" w:eastAsia="Times New Roman" w:hAnsi="Times New Roman" w:cs="Times New Roman"/>
+          <w:sz w:val="24"/>
+          <w:szCs w:val="24"/>
+        </w:rPr>
+        <w:t xml:space="preserve">  </w:t>
+      </w:r>
+      <w:proofErr w:type="gramEnd"/>
+      <w:r>
+        <w:rPr>
+          <w:rFonts w:ascii="Times New Roman" w:eastAsia="Times New Roman" w:hAnsi="Times New Roman" w:cs="Times New Roman"/>
+          <w:sz w:val="24"/>
+          <w:szCs w:val="24"/>
+        </w:rPr>
+        <w:t>Depois classifica por pontos DESC + desempate</w:t>
+      </w:r>
+      <w:r>
+        <w:br w:type="page"/>
+      </w:r>
+    </w:p>
+    <w:p>
+      <w:pPr>
+        <w:pStyle w:val="Heading3"/>
+      </w:pPr>
+      <w:r>
+        <w:lastRenderedPageBreak/>
+        <w:t>4</w:t>
+      </w:r>
+      <w:r>
+        <w:t>. Glossário de Termos</w:t>
       </w:r>
     </w:p>
     <w:p>
@@ -2851,7 +3280,6 @@
                 <w:sz w:val="20"/>
                 <w:szCs w:val="20"/>
               </w:rPr>
-              <w:lastRenderedPageBreak/>
               <w:t>Lista de Espera</w:t>
             </w:r>
           </w:p>
@@ -3741,6 +4169,7 @@
                 <w:sz w:val="20"/>
                 <w:szCs w:val="20"/>
               </w:rPr>
+              <w:lastRenderedPageBreak/>
               <w:t>ClassificadorService</w:t>
             </w:r>
             <w:proofErr w:type="spellEnd"/>
@@ -4701,8 +5130,10 @@
         <w:pStyle w:val="Heading3"/>
       </w:pPr>
       <w:r>
-        <w:lastRenderedPageBreak/>
-        <w:t xml:space="preserve">4. Dicionário de Dados — </w:t>
+        <w:t>5</w:t>
+      </w:r>
+      <w:r>
+        <w:t xml:space="preserve">. Dicionário de Dados — </w:t>
       </w:r>
       <w:proofErr w:type="spellStart"/>
       <w:r>
@@ -5668,8 +6099,30 @@
       <w:pPr>
         <w:pStyle w:val="Heading3"/>
       </w:pPr>
-      <w:r>
-        <w:t xml:space="preserve">5. Dicionário de Dados — </w:t>
+    </w:p>
+    <w:p>
+      <w:pPr>
+        <w:rPr>
+          <w:b/>
+          <w:bCs/>
+          <w:sz w:val="28"/>
+          <w:szCs w:val="28"/>
+        </w:rPr>
+      </w:pPr>
+      <w:r>
+        <w:br w:type="page"/>
+      </w:r>
+    </w:p>
+    <w:p>
+      <w:pPr>
+        <w:pStyle w:val="Heading3"/>
+      </w:pPr>
+      <w:r>
+        <w:lastRenderedPageBreak/>
+        <w:t>6</w:t>
+      </w:r>
+      <w:r>
+        <w:t xml:space="preserve">. Dicionário de Dados — </w:t>
       </w:r>
       <w:proofErr w:type="spellStart"/>
       <w:r>
@@ -7790,6 +8243,22 @@
       <w:szCs w:val="16"/>
     </w:rPr>
   </w:style>
+  <w:style w:type="paragraph" w:styleId="NormalWeb">
+    <w:name w:val="Normal (Web)"/>
+    <w:basedOn w:val="Normal"/>
+    <w:uiPriority w:val="99"/>
+    <w:semiHidden/>
+    <w:unhideWhenUsed/>
+    <w:rsid w:val="00FC1781"/>
+    <w:pPr>
+      <w:spacing w:before="100" w:beforeAutospacing="1" w:after="100" w:afterAutospacing="1" w:line="240" w:lineRule="auto"/>
+    </w:pPr>
+    <w:rPr>
+      <w:rFonts w:ascii="Times New Roman" w:eastAsia="Times New Roman" w:hAnsi="Times New Roman" w:cs="Times New Roman"/>
+      <w:sz w:val="24"/>
+      <w:szCs w:val="24"/>
+    </w:rPr>
+  </w:style>
 </w:styles>
 </file>
 

</xml_diff>